<commit_message>
Thesis A: third review round (burden withdrawn to method only; representativeness and humidity claims weakened; episode relabelled; docs synced)
Co-Authored-By: Claude Opus 5.5 <noreply@anthropic.com>
</commit_message>
<xml_diff>
--- a/#writing/summary/summary.docx
+++ b/#writing/summary/summary.docx
@@ -47,7 +47,7 @@
         <w:t xml:space="preserve"> </w:t>
       </w:r>
       <w:r>
-        <w:t xml:space="preserve">50,937 words, 34 figures and 13 tables, and</w:t>
+        <w:t xml:space="preserve">50,922 words, 33 figures and 13 tables, and</w:t>
       </w:r>
       <w:r>
         <w:t xml:space="preserve"> </w:t>
@@ -808,7 +808,7 @@
         <w:t xml:space="preserve"> </w:t>
       </w:r>
       <w:r>
-        <w:t xml:space="preserve">supported on days the sensors reported. Morning and evening peaks either side of a midday trough are</w:t>
+        <w:t xml:space="preserve">supported on days the sensors reported. Morning and evening peaks either side of a midday dip are</w:t>
       </w:r>
       <w:r>
         <w:t xml:space="preserve"> </w:t>
@@ -820,7 +820,7 @@
         <w:t xml:space="preserve"> </w:t>
       </w:r>
       <w:r>
-        <w:t xml:space="preserve">hourly rather than constant humidity the peak-to-trough ratio falls from</w:t>
+        <w:t xml:space="preserve">hourly rather than constant humidity the morning-peak-to-midday ratio falls from</w:t>
       </w:r>
       <w:r>
         <w:t xml:space="preserve"> </w:t>

</xml_diff>

<commit_message>
Kandy evidence without new data (F.128): NBRO daily record digitised, leave-one-sensor-out, level range; dispersion removed from the delivered field
- NBRO Kandy daily PM2.5 2021-22 recovered from Nirmani et al. 2025 Fig. 3 (annual means within +4/-2 %): daily r 0.39,
  month climatology 0.77, 2022 missed, within-month 0.28; split by sensor-reporting days reproduces the ladder rung.
- Leave-one-sensor-out at Kandy: held-out daily r 0.52/0.62 vs prior 0.31/0.38.
- Level range from the satellite level's error across 25 tropical cities: 13.5-22.1 ug/m3, at least 2.7x WHO.
- Delivered pattern switched to S_emit x M (the construction the ten-city scorecard scored); dispersion removed.
  Consequences regenerated: NBRO annual now -7.4/-12.1 % (records bracket the field), exposure uplift 6 %.
- Thesis: new 3.2.2 and Table 3.3, ledger/validation tables, conclusions, abstract, summary; README P_local corrected.

Co-Authored-By: Claude Opus 5.5 <noreply@anthropic.com>
</commit_message>
<xml_diff>
--- a/#writing/summary/summary.docx
+++ b/#writing/summary/summary.docx
@@ -47,7 +47,7 @@
         <w:t xml:space="preserve"> </w:t>
       </w:r>
       <w:r>
-        <w:t xml:space="preserve">51,227 words, 33 figures and 13 tables, and</w:t>
+        <w:t xml:space="preserve">52,473 words, 33 figures and 14 tables, and</w:t>
       </w:r>
       <w:r>
         <w:t xml:space="preserve"> </w:t>
@@ -597,13 +597,13 @@
         <w:t xml:space="preserve"> </w:t>
       </w:r>
       <w:r>
-        <w:t xml:space="preserve">a satellite surface, a terrain-confinement term and a road-traffic emission surface carried through a</w:t>
-      </w:r>
-      <w:r>
-        <w:t xml:space="preserve"> </w:t>
-      </w:r>
-      <w:r>
-        <w:t xml:space="preserve">terrain-steered dispersion step. The field averages to</w:t>
+        <w:t xml:space="preserve">a satellite surface with a terrain-confinement term; a terrain-steered dispersion step was removed</w:t>
+      </w:r>
+      <w:r>
+        <w:t xml:space="preserve"> </w:t>
+      </w:r>
+      <w:r>
+        <w:t xml:space="preserve">after it lowered agreement with held-out stations. The field averages to</w:t>
       </w:r>
       <w:r>
         <w:t xml:space="preserve"> </w:t>
@@ -742,19 +742,37 @@
         <w:t xml:space="preserve"> </w:t>
       </w:r>
       <w:r>
-        <w:t xml:space="preserve">0.696. At Kandy an independent national record differs from the</w:t>
-      </w:r>
-      <w:r>
-        <w:t xml:space="preserve"> </w:t>
-      </w:r>
-      <w:r>
-        <w:t xml:space="preserve">field by 0.7 and -2.6 per cent in two years, while</w:t>
-      </w:r>
-      <w:r>
-        <w:t xml:space="preserve"> </w:t>
-      </w:r>
-      <w:r>
-        <w:t xml:space="preserve">three low-cost records sit below it.</w:t>
+        <w:t xml:space="preserve">0.696. At Kandy the national research organisation’s daily record for 2021 and 2022,</w:t>
+      </w:r>
+      <w:r>
+        <w:t xml:space="preserve"> </w:t>
+      </w:r>
+      <w:r>
+        <w:t xml:space="preserve">recovered from a published figure, matches the field’s seasonal shape (correlation</w:t>
+      </w:r>
+      <w:r>
+        <w:t xml:space="preserve"> </w:t>
+      </w:r>
+      <w:r>
+        <w:t xml:space="preserve">0.77 across calendar months) but not its day-to-day variation (within-month</w:t>
+      </w:r>
+      <w:r>
+        <w:t xml:space="preserve"> </w:t>
+      </w:r>
+      <w:r>
+        <w:t xml:space="preserve">correlation 0.284), and the field misses the crisis year 2022. Trained on one</w:t>
+      </w:r>
+      <w:r>
+        <w:t xml:space="preserve"> </w:t>
+      </w:r>
+      <w:r>
+        <w:t xml:space="preserve">Kandy sensor, the temporal model tracks the other at a daily correlation of</w:t>
+      </w:r>
+      <w:r>
+        <w:t xml:space="preserve"> </w:t>
+      </w:r>
+      <w:r>
+        <w:t xml:space="preserve">0.521 and 0.615.</w:t>
       </w:r>
     </w:p>
     <w:bookmarkEnd w:id="12"/>
@@ -778,19 +796,31 @@
         <w:t xml:space="preserve"> </w:t>
       </w:r>
       <w:r>
-        <w:t xml:space="preserve">cubic metre over 2019 to 2023, above the World Health Organization guideline of 5 in every year;</w:t>
-      </w:r>
-      <w:r>
-        <w:t xml:space="preserve"> </w:t>
-      </w:r>
-      <w:r>
-        <w:t xml:space="preserve">because the absolute level is unresolved, this describes the modelled field rather than an</w:t>
-      </w:r>
-      <w:r>
-        <w:t xml:space="preserve"> </w:t>
-      </w:r>
-      <w:r>
-        <w:t xml:space="preserve">established exposure. The seasonal cycle is the best-supported property, with the maximum in the</w:t>
+        <w:t xml:space="preserve">cubic metre over 2019 to 2023, above the World Health Organization guideline of 5 in every year.</w:t>
+      </w:r>
+      <w:r>
+        <w:t xml:space="preserve"> </w:t>
+      </w:r>
+      <w:r>
+        <w:t xml:space="preserve">The level itself is unresolved: the national record sits above the field and three low-cost records</w:t>
+      </w:r>
+      <w:r>
+        <w:t xml:space="preserve"> </w:t>
+      </w:r>
+      <w:r>
+        <w:t xml:space="preserve">below. The exceedance is robust to it: if the satellite level errs at Kandy as it does in the middle</w:t>
+      </w:r>
+      <w:r>
+        <w:t xml:space="preserve"> </w:t>
+      </w:r>
+      <w:r>
+        <w:t xml:space="preserve">half of the tropical cities on the ladder, the basin mean is 13.5 to</w:t>
+      </w:r>
+      <w:r>
+        <w:t xml:space="preserve"> </w:t>
+      </w:r>
+      <w:r>
+        <w:t xml:space="preserve">22.1, at least 2.7 times the guideline. The seasonal cycle is the best-supported property, with the maximum in the</w:t>
       </w:r>
       <w:r>
         <w:t xml:space="preserve"> </w:t>
@@ -838,7 +868,7 @@
         <w:t xml:space="preserve"> </w:t>
       </w:r>
       <w:r>
-        <w:t xml:space="preserve">72.4 per cent of sensor hours with misses almost all on one side, which points to a</w:t>
+        <w:t xml:space="preserve">72.5 per cent of sensor hours with misses almost all on one side, which points to a</w:t>
       </w:r>
       <w:r>
         <w:t xml:space="preserve"> </w:t>
@@ -982,25 +1012,25 @@
         <w:t xml:space="preserve"> </w:t>
       </w:r>
       <w:r>
-        <w:t xml:space="preserve">between cells (1.05). The dispersion step meant to place the local</w:t>
-      </w:r>
-      <w:r>
-        <w:t xml:space="preserve"> </w:t>
-      </w:r>
-      <w:r>
-        <w:t xml:space="preserve">increment ranks held-out stations at 0.274, below the undispersed surface</w:t>
-      </w:r>
-      <w:r>
-        <w:t xml:space="preserve"> </w:t>
-      </w:r>
-      <w:r>
-        <w:t xml:space="preserve">(0.371) and a free built-up layer (0.393), so it is a declared choice,</w:t>
-      </w:r>
-      <w:r>
-        <w:t xml:space="preserve"> </w:t>
-      </w:r>
-      <w:r>
-        <w:t xml:space="preserve">not a validated improvement, and three to eight stations do not rank neighbourhoods usefully either.</w:t>
+        <w:t xml:space="preserve">between cells (1.04). A dispersion step meant to place the local</w:t>
+      </w:r>
+      <w:r>
+        <w:t xml:space="preserve"> </w:t>
+      </w:r>
+      <w:r>
+        <w:t xml:space="preserve">increment ranked held-out stations at 0.274, below the undispersed surface</w:t>
+      </w:r>
+      <w:r>
+        <w:t xml:space="preserve"> </w:t>
+      </w:r>
+      <w:r>
+        <w:t xml:space="preserve">(0.371) and a free built-up layer (0.393), and was removed; three to eight</w:t>
+      </w:r>
+      <w:r>
+        <w:t xml:space="preserve"> </w:t>
+      </w:r>
+      <w:r>
+        <w:t xml:space="preserve">stations do not rank neighbourhoods usefully either.</w:t>
       </w:r>
       <w:r>
         <w:t xml:space="preserve"> </w:t>

</xml_diff>

<commit_message>
CEA 2024-2026 pulled; level excess located at the satellite re-anchoring (F.131)
- Hourly record extended to 2026-10 (30,934 hours). Timestamp conventions differ by source: manual upload
  sets are UTC, the live feed from 2025-09 is local (identified from the CO cycle); t_local written per record.
- On 126 days with both the station and FECT Akurana: corrected sensor -5 % (r 0.89), basin anchor after
  van Donkelaar re-anchoring +17 %, field +22 %; satellite city level +23 to +34 % vs station. The low-cost
  calibration is confirmed against a reference; the excess enters at the satellite level.
- 2024-2026 extension tier vs the station: -17 %, daily r 0.64 (station climatology 0.63); peak exaggerated.
- Thesis, summary, ledger, CONTEXT, CLAUDE.md (gotcha #106 corrected, W5), reproduction guide updated.

Co-Authored-By: Claude Opus 5.5 <noreply@anthropic.com>
</commit_message>
<xml_diff>
--- a/#writing/summary/summary.docx
+++ b/#writing/summary/summary.docx
@@ -47,7 +47,7 @@
         <w:t xml:space="preserve"> </w:t>
       </w:r>
       <w:r>
-        <w:t xml:space="preserve">54,433 words, 33 figures and 15 tables, and</w:t>
+        <w:t xml:space="preserve">55,001 words, 33 figures and 15 tables, and</w:t>
       </w:r>
       <w:r>
         <w:t xml:space="preserve"> </w:t>
@@ -814,7 +814,7 @@
         <w:t xml:space="preserve"> </w:t>
       </w:r>
       <w:r>
-        <w:t xml:space="preserve">The level is probably too high: the regulatory station reads 24.0 per cent</w:t>
+        <w:t xml:space="preserve">The level is probably too high: the regulatory station reads 24 per cent</w:t>
       </w:r>
       <w:r>
         <w:t xml:space="preserve"> </w:t>
@@ -826,7 +826,19 @@
         <w:t xml:space="preserve"> </w:t>
       </w:r>
       <w:r>
-        <w:t xml:space="preserve">undocumented instrument, sits above it. The exceedance is robust to it: if the satellite level errs at Kandy as it does in the middle</w:t>
+        <w:t xml:space="preserve">undocumented instrument, sits above it. The excess enters where the anchor’s level is set from the</w:t>
+      </w:r>
+      <w:r>
+        <w:t xml:space="preserve"> </w:t>
+      </w:r>
+      <w:r>
+        <w:t xml:space="preserve">satellite surface: the corrected low-cost record is within -5 per cent of the</w:t>
+      </w:r>
+      <w:r>
+        <w:t xml:space="preserve"> </w:t>
+      </w:r>
+      <w:r>
+        <w:t xml:space="preserve">station on shared days. The exceedance is robust to it: if the satellite level errs at Kandy as it does in the middle</w:t>
       </w:r>
       <w:r>
         <w:t xml:space="preserve"> </w:t>

</xml_diff>

<commit_message>
Thesis: local fraction against measurements (new Section 3.2.4, F.134); release frozen as r10
- New subsection and Table 3.5: urban excess over regional towns (0.36 against the cleanest, a lower bound;
  0.20 against the median), combustion-tracer intercept 0.53 [0.48, 0.59], curfew 0.40 as context, PMF floor;
  model at the station cell 0.51. Statement: measured local share at the city centre about 0.36-0.53, with
  the model at the upper end; the basin value 0.479 is within it but may be somewhat high.
- Pointers in the partition section, abstract (349 words), conclusions, discussion, summary, Tables 3.x/4.x.
- Claims lfs.* from local_fraction_e{1,2,3}.json; verify_report classifies them with the Kandy chain.
- README, reproduction guide (2,231 claims, 683 cited), CLAUDE.md, CONTEXT synchronised.

Co-Authored-By: Claude Opus 5.5 <noreply@anthropic.com>
</commit_message>
<xml_diff>
--- a/#writing/summary/summary.docx
+++ b/#writing/summary/summary.docx
@@ -47,7 +47,7 @@
         <w:t xml:space="preserve"> </w:t>
       </w:r>
       <w:r>
-        <w:t xml:space="preserve">55,603 words, 33 figures and 15 tables, and</w:t>
+        <w:t xml:space="preserve">57,111 words, 33 figures and 16 tables, and</w:t>
       </w:r>
       <w:r>
         <w:t xml:space="preserve"> </w:t>
@@ -946,7 +946,19 @@
         <w:t xml:space="preserve"> </w:t>
       </w:r>
       <w:r>
-        <w:t xml:space="preserve">with a 48-hour background window: a property of the decomposition, not a source apportionment.</w:t>
+        <w:t xml:space="preserve">with a 48-hour background window: a property of the decomposition, not a source apportionment. Measured at the</w:t>
+      </w:r>
+      <w:r>
+        <w:t xml:space="preserve"> </w:t>
+      </w:r>
+      <w:r>
+        <w:t xml:space="preserve">regulatory station, the local share lies between about 0.36 (urban excess over the cleanest regional</w:t>
+      </w:r>
+      <w:r>
+        <w:t xml:space="preserve"> </w:t>
+      </w:r>
+      <w:r>
+        <w:t xml:space="preserve">town, a lower bound) and 0.53 (combustion-tracer intercept), with the model at the upper end.</w:t>
       </w:r>
     </w:p>
     <w:bookmarkEnd w:id="13"/>

</xml_diff>

<commit_message>
Thesis shaped toward the continuation programme: the reconstruction as a locked hypothesis (r12)
- Future work (Section 4.2) rewritten as four phases the author will pursue: CEA provenance and a
  calibration/validation register; low-cost sensors evaluated against the reference over two monsoons
  (decides the humidity correction); a 35-site network used to test, not fit, the field, with each test's
  power stated in advance (new Table 4.2; the one-kilometre rank test detects only gross failure); a rural
  background reference and composition. How each outcome feeds back into the construction.
- Conclusion 6, the abstract's closing sentence, the summary and the measurement-priorities section point to it;
  references to the old future-work anchors remapped.
- Verification report classifies the design claims; README and reproduction guide point to r12 and the proposal.

Co-Authored-By: Claude Opus 5.5 <noreply@anthropic.com>
</commit_message>
<xml_diff>
--- a/#writing/summary/summary.docx
+++ b/#writing/summary/summary.docx
@@ -47,7 +47,7 @@
         <w:t xml:space="preserve"> </w:t>
       </w:r>
       <w:r>
-        <w:t xml:space="preserve">57,448 words, 33 figures and 16 tables, and</w:t>
+        <w:t xml:space="preserve">58,596 words, 33 figures and 17 tables, and</w:t>
       </w:r>
       <w:r>
         <w:t xml:space="preserve"> </w:t>
@@ -1126,19 +1126,43 @@
         <w:pStyle w:val="FirstParagraph"/>
       </w:pPr>
       <w:r>
-        <w:t xml:space="preserve">A formal agreement for the regulatory record, and co-locating the low-cost sensors with it, would</w:t>
-      </w:r>
-      <w:r>
-        <w:t xml:space="preserve"> </w:t>
-      </w:r>
-      <w:r>
-        <w:t xml:space="preserve">fix the size of the level excess and show where the sensor record’s nights go wrong. A fresh pre-registered</w:t>
-      </w:r>
-      <w:r>
-        <w:t xml:space="preserve"> </w:t>
-      </w:r>
-      <w:r>
-        <w:t xml:space="preserve">like-for-like test and an independent reproduction are the next steps for the cross-city results.</w:t>
+        <w:t xml:space="preserve">The research that follows treats the delivered field as a locked hypothesis, with its predictions registered</w:t>
+      </w:r>
+      <w:r>
+        <w:t xml:space="preserve"> </w:t>
+      </w:r>
+      <w:r>
+        <w:t xml:space="preserve">before any instrument is bought, and collects observations able to refute it, in four phases: the regulatory</w:t>
+      </w:r>
+      <w:r>
+        <w:t xml:space="preserve"> </w:t>
+      </w:r>
+      <w:r>
+        <w:t xml:space="preserve">record’s provenance and a register of what calibrates and what checks the model; low-cost sensors evaluated against</w:t>
+      </w:r>
+      <w:r>
+        <w:t xml:space="preserve"> </w:t>
+      </w:r>
+      <w:r>
+        <w:t xml:space="preserve">the reference over two monsoons, which also decides the humidity correction; a distributed network whose level,</w:t>
+      </w:r>
+      <w:r>
+        <w:t xml:space="preserve"> </w:t>
+      </w:r>
+      <w:r>
+        <w:t xml:space="preserve">within-cell, drainage and daily-cycle tests are powered to give an answer, while a one-kilometre ranking test can</w:t>
+      </w:r>
+      <w:r>
+        <w:t xml:space="preserve"> </w:t>
+      </w:r>
+      <w:r>
+        <w:t xml:space="preserve">only detect gross failure; and a rural background reference with composition measurement. A fresh pre-registered</w:t>
+      </w:r>
+      <w:r>
+        <w:t xml:space="preserve"> </w:t>
+      </w:r>
+      <w:r>
+        <w:t xml:space="preserve">like-for-like ladder test and an independent reproduction accompany it.</w:t>
       </w:r>
       <w:r>
         <w:t xml:space="preserve"> </w:t>

</xml_diff>

<commit_message>
Ninth review: seasonal null baseline (F.135) and presentation fixes (r15)
- scorecard_seasonal_baseline.py: on the scorecard's own rows, the prior alone reaches seasonal r 0.915 (model
  better in 9/10) and the two anchor stations' climatology 0.986 (model better in only 4/10, median -0.002).
  The seasonal agreement is inherited from the anchors; abstract, conclusions, ten-city section, summary and
  tables reframed accordingly.
- Fixed the "+-11 per cent" table bug; labelled the three night-to-midday values (2023 field 1.13, anchor over
  all hours 1.16, anchor on station hours 1.17); removed 17 internal ledger tags; Table 2.2 lists every city
  panel; stated why the humidity/day-boundary rebuild was not done and the limits of self-registration.
- Figure audit 33/33 clean; abstract 350 words; summary 2 pages.

Co-Authored-By: Claude Opus 5.5 <noreply@anthropic.com>
</commit_message>
<xml_diff>
--- a/#writing/summary/summary.docx
+++ b/#writing/summary/summary.docx
@@ -47,7 +47,7 @@
         <w:t xml:space="preserve"> </w:t>
       </w:r>
       <w:r>
-        <w:t xml:space="preserve">58,838 words, 33 figures and 17 tables, and</w:t>
+        <w:t xml:space="preserve">59,514 words, 33 figures and 18 tables, and</w:t>
       </w:r>
       <w:r>
         <w:t xml:space="preserve"> </w:t>
@@ -682,13 +682,19 @@
         <w:t xml:space="preserve"> </w:t>
       </w:r>
       <w:r>
-        <w:t xml:space="preserve">against withheld stations: the seasonal cycle transfers everywhere (correlation</w:t>
-      </w:r>
-      <w:r>
-        <w:t xml:space="preserve"> </w:t>
-      </w:r>
-      <w:r>
-        <w:t xml:space="preserve">0.943 to 0.996), the daily cycle unevenly</w:t>
+        <w:t xml:space="preserve">against withheld stations: the seasonal cycle carries everywhere (correlation</w:t>
+      </w:r>
+      <w:r>
+        <w:t xml:space="preserve"> </w:t>
+      </w:r>
+      <w:r>
+        <w:t xml:space="preserve">0.943 to 0.996), though no better than the two anchor stations’</w:t>
+      </w:r>
+      <w:r>
+        <w:t xml:space="preserve"> </w:t>
+      </w:r>
+      <w:r>
+        <w:t xml:space="preserve">own climatology (0.986), and the daily cycle unevenly</w:t>
       </w:r>
       <w:r>
         <w:t xml:space="preserve"> </w:t>
@@ -1126,43 +1132,25 @@
         <w:pStyle w:val="FirstParagraph"/>
       </w:pPr>
       <w:r>
-        <w:t xml:space="preserve">The research that follows treats the delivered field as a locked hypothesis, with its predictions registered</w:t>
-      </w:r>
-      <w:r>
-        <w:t xml:space="preserve"> </w:t>
-      </w:r>
-      <w:r>
-        <w:t xml:space="preserve">before any instrument is bought, and collects observations able to refute it, in four phases: the regulatory</w:t>
-      </w:r>
-      <w:r>
-        <w:t xml:space="preserve"> </w:t>
-      </w:r>
-      <w:r>
-        <w:t xml:space="preserve">record’s provenance and a register of what calibrates and what checks the model; low-cost sensors evaluated against</w:t>
-      </w:r>
-      <w:r>
-        <w:t xml:space="preserve"> </w:t>
-      </w:r>
-      <w:r>
-        <w:t xml:space="preserve">the reference over two monsoons, which also decides the humidity correction; a distributed network whose level,</w:t>
-      </w:r>
-      <w:r>
-        <w:t xml:space="preserve"> </w:t>
-      </w:r>
-      <w:r>
-        <w:t xml:space="preserve">within-cell, drainage and daily-cycle tests are powered to give an answer, while a one-kilometre ranking test can</w:t>
-      </w:r>
-      <w:r>
-        <w:t xml:space="preserve"> </w:t>
-      </w:r>
-      <w:r>
-        <w:t xml:space="preserve">only detect gross failure; and a rural background reference with composition measurement. A fresh pre-registered</w:t>
-      </w:r>
-      <w:r>
-        <w:t xml:space="preserve"> </w:t>
-      </w:r>
-      <w:r>
-        <w:t xml:space="preserve">like-for-like ladder test and an independent reproduction accompany it.</w:t>
+        <w:t xml:space="preserve">The research that follows treats the delivered field as a locked hypothesis and collects observations able to</w:t>
+      </w:r>
+      <w:r>
+        <w:t xml:space="preserve"> </w:t>
+      </w:r>
+      <w:r>
+        <w:t xml:space="preserve">refute it: the regulatory record’s provenance; low-cost sensors evaluated against the reference over two monsoons; a</w:t>
+      </w:r>
+      <w:r>
+        <w:t xml:space="preserve"> </w:t>
+      </w:r>
+      <w:r>
+        <w:t xml:space="preserve">network whose level, within-cell, drainage and daily-cycle tests are powered to give an answer; and a rural</w:t>
+      </w:r>
+      <w:r>
+        <w:t xml:space="preserve"> </w:t>
+      </w:r>
+      <w:r>
+        <w:t xml:space="preserve">background reference with composition measurement.</w:t>
       </w:r>
       <w:r>
         <w:t xml:space="preserve"> </w:t>

</xml_diff>

<commit_message>
F.136: interval coverage at the CEA station (hourly interval too narrow, misses two-sided) and the background against the regional network (r17)
Held-out hours 68.7 % covered, offset +0.8, half-widths need x1.86; reverses the sensor-only
'centring, not width' diagnosis. Background construction vs AirShare regional towns 2024-25:
within-month anomaly r 0.54 (station 0.79), all from GEOS-CF. Spec 1272bea written before scoring.

Co-Authored-By: Claude Opus 5.5 <noreply@anthropic.com>
</commit_message>
<xml_diff>
--- a/#writing/summary/summary.docx
+++ b/#writing/summary/summary.docx
@@ -47,7 +47,7 @@
         <w:t xml:space="preserve"> </w:t>
       </w:r>
       <w:r>
-        <w:t xml:space="preserve">59,013 words, 33 figures and 18 tables, and</w:t>
+        <w:t xml:space="preserve">59,856 words, 33 figures and 18 tables, and</w:t>
       </w:r>
       <w:r>
         <w:t xml:space="preserve"> </w:t>
@@ -922,13 +922,13 @@
         <w:t xml:space="preserve"> </w:t>
       </w:r>
       <w:r>
-        <w:t xml:space="preserve">77.3 per cent of sensor hours with misses almost all on one side, which points to a</w:t>
-      </w:r>
-      <w:r>
-        <w:t xml:space="preserve"> </w:t>
-      </w:r>
-      <w:r>
-        <w:t xml:space="preserve">calibration bias at the sensors rather than proving the width right. Under the baseline decomposition</w:t>
+        <w:t xml:space="preserve">77.3 per cent of sensor hours, missing almost all on one side, but at the regulatory</w:t>
+      </w:r>
+      <w:r>
+        <w:t xml:space="preserve"> </w:t>
+      </w:r>
+      <w:r>
+        <w:t xml:space="preserve">station 68.7 per cent of held-out hours, missing on both sides: too narrow. Under the baseline decomposition</w:t>
       </w:r>
       <w:r>
         <w:t xml:space="preserve"> </w:t>

</xml_diff>

<commit_message>
F.137: daily cycle refitted to the CEA station and interval widened x1.55, both fitted on 2019 to mid-2021 and checked on later hours (r18)
Spec febb94d written before scoring. Held-out hours: night/midday 0.77 vs station 0.69 (was 1.17), daily-cycle
shape r 0.98 (was 0.70), hourly RMSE 11.85 -> 11.40, daily skill unchanged; interval coverage 68.7 -> 87.1 %
(daily 95 %). Local fraction 0.479 -> 0.505 (lower nights lower the capped background). Field rebuilt from
predict_T_anchor_v3; sharpen_T_diurnal now runs once (gotcha #109); release parity 0.0. Pre-F.137 products kept
in decomp/backup_fect_diurnal_2026-10-12, read by the humidity and daily-cycle scenarios, which reproduce their
records exactly. Thesis, summary, tables, README, ledger, CONTEXT updated; 33/33 figures rebuilt (8 changed, 0 flags).

Co-Authored-By: Claude Opus 5.5 <noreply@anthropic.com>
</commit_message>
<xml_diff>
--- a/#writing/summary/summary.docx
+++ b/#writing/summary/summary.docx
@@ -47,7 +47,7 @@
         <w:t xml:space="preserve"> </w:t>
       </w:r>
       <w:r>
-        <w:t xml:space="preserve">59,856 words, 33 figures and 18 tables, and</w:t>
+        <w:t xml:space="preserve">60,587 words, 33 figures and 18 tables, and</w:t>
       </w:r>
       <w:r>
         <w:t xml:space="preserve"> </w:t>
@@ -760,7 +760,7 @@
         <w:t xml:space="preserve"> </w:t>
       </w:r>
       <w:r>
-        <w:t xml:space="preserve">correlation 0.285), and the field misses the crisis year 2022. Trained on one</w:t>
+        <w:t xml:space="preserve">correlation 0.289), and the field misses the crisis year 2022. Trained on one</w:t>
       </w:r>
       <w:r>
         <w:t xml:space="preserve"> </w:t>
@@ -784,7 +784,7 @@
         <w:t xml:space="preserve"> </w:t>
       </w:r>
       <w:r>
-        <w:t xml:space="preserve">daily correlation is 0.6 (0.72 within the month).</w:t>
+        <w:t xml:space="preserve">daily correlation is 0.6 (0.73 within the month).</w:t>
       </w:r>
     </w:p>
     <w:bookmarkEnd w:id="12"/>
@@ -862,13 +862,13 @@
         <w:t xml:space="preserve"> </w:t>
       </w:r>
       <w:r>
-        <w:t xml:space="preserve">north-east monsoon (24.2 in December to February of 2023) and</w:t>
-      </w:r>
-      <w:r>
-        <w:t xml:space="preserve"> </w:t>
-      </w:r>
-      <w:r>
-        <w:t xml:space="preserve">the minimum in the south-west monsoon (9.4). The day-to-day sequence is</w:t>
+        <w:t xml:space="preserve">north-east monsoon (24.3 in December to February of 2023) and</w:t>
+      </w:r>
+      <w:r>
+        <w:t xml:space="preserve"> </w:t>
+      </w:r>
+      <w:r>
+        <w:t xml:space="preserve">the minimum in the south-west monsoon (9.3). The day-to-day sequence is</w:t>
       </w:r>
       <w:r>
         <w:t xml:space="preserve"> </w:t>
@@ -904,43 +904,55 @@
         <w:t xml:space="preserve"> </w:t>
       </w:r>
       <w:r>
-        <w:t xml:space="preserve">station’s hourly record has the same timing and a morning peak like the delivered field’s, but its</w:t>
-      </w:r>
-      <w:r>
-        <w:t xml:space="preserve"> </w:t>
-      </w:r>
-      <w:r>
-        <w:t xml:space="preserve">deep night is the daily minimum (0.71 of midday), so the</w:t>
-      </w:r>
-      <w:r>
-        <w:t xml:space="preserve"> </w:t>
-      </w:r>
-      <w:r>
-        <w:t xml:space="preserve">field’s nights are too high. The interval covers</w:t>
-      </w:r>
-      <w:r>
-        <w:t xml:space="preserve"> </w:t>
-      </w:r>
-      <w:r>
-        <w:t xml:space="preserve">77.3 per cent of sensor hours, missing almost all on one side, but at the regulatory</w:t>
-      </w:r>
-      <w:r>
-        <w:t xml:space="preserve"> </w:t>
-      </w:r>
-      <w:r>
-        <w:t xml:space="preserve">station 68.7 per cent of held-out hours, missing on both sides: too narrow. Under the baseline decomposition</w:t>
-      </w:r>
-      <w:r>
-        <w:t xml:space="preserve"> </w:t>
-      </w:r>
-      <w:r>
-        <w:t xml:space="preserve">the local increment is 0.479 of the modelled total, 0.428 to</w:t>
-      </w:r>
-      <w:r>
-        <w:t xml:space="preserve"> </w:t>
-      </w:r>
-      <w:r>
-        <w:t xml:space="preserve">0.489 across the tested ways of applying the cap and 0.538</w:t>
+        <w:t xml:space="preserve">station’s hourly record has the same timing, but its deep night is the daily minimum</w:t>
+      </w:r>
+      <w:r>
+        <w:t xml:space="preserve"> </w:t>
+      </w:r>
+      <w:r>
+        <w:t xml:space="preserve">(0.71 of midday), so the delivered cycle was refitted to</w:t>
+      </w:r>
+      <w:r>
+        <w:t xml:space="preserve"> </w:t>
+      </w:r>
+      <w:r>
+        <w:t xml:space="preserve">the station on 2019 to mid-2021; on later hours its night runs</w:t>
+      </w:r>
+      <w:r>
+        <w:t xml:space="preserve"> </w:t>
+      </w:r>
+      <w:r>
+        <w:t xml:space="preserve">0.77 of midday, against</w:t>
+      </w:r>
+      <w:r>
+        <w:t xml:space="preserve"> </w:t>
+      </w:r>
+      <w:r>
+        <w:t xml:space="preserve">1.17 before. The interval, too narrow there at first</w:t>
+      </w:r>
+      <w:r>
+        <w:t xml:space="preserve"> </w:t>
+      </w:r>
+      <w:r>
+        <w:t xml:space="preserve">(68.7 per cent of held-out hours), was widened on the same early years and</w:t>
+      </w:r>
+      <w:r>
+        <w:t xml:space="preserve"> </w:t>
+      </w:r>
+      <w:r>
+        <w:t xml:space="preserve">now contains 87.1 per cent. Under the baseline decomposition</w:t>
+      </w:r>
+      <w:r>
+        <w:t xml:space="preserve"> </w:t>
+      </w:r>
+      <w:r>
+        <w:t xml:space="preserve">the local increment is 0.505 of the modelled total, 0.447 to</w:t>
+      </w:r>
+      <w:r>
+        <w:t xml:space="preserve"> </w:t>
+      </w:r>
+      <w:r>
+        <w:t xml:space="preserve">0.518 across the tested ways of applying the cap and 0.565</w:t>
       </w:r>
       <w:r>
         <w:t xml:space="preserve"> </w:t>
@@ -1072,13 +1084,13 @@
         <w:t xml:space="preserve"> </w:t>
       </w:r>
       <w:r>
-        <w:t xml:space="preserve">monitored cities the spread inside a cell (1.21) exceeds the spread</w:t>
-      </w:r>
-      <w:r>
-        <w:t xml:space="preserve"> </w:t>
-      </w:r>
-      <w:r>
-        <w:t xml:space="preserve">between cells (1.04). A dispersion step meant to place the local</w:t>
+        <w:t xml:space="preserve">monitored cities the spread inside a cell (1.27) exceeds the spread</w:t>
+      </w:r>
+      <w:r>
+        <w:t xml:space="preserve"> </w:t>
+      </w:r>
+      <w:r>
+        <w:t xml:space="preserve">between cells (1.05). A dispersion step meant to place the local</w:t>
       </w:r>
       <w:r>
         <w:t xml:space="preserve"> </w:t>

</xml_diff>

<commit_message>
Writing audit of Thesis A (read-only script + prioritised reading); four passages left stale by r18 corrected (r19)
The humidity scenario, conclusion 2, the discussion and the summary still described the sensor-shaped anchor as the
delivered field after its daily cycle was refitted to the CEA station. Audit: 7 review-process sentences, 11
near-duplicate pairs, 19 number-dense and 18 over-long main-text sentences, terminology variants (incl. two meanings
of 'anchor'); #writing/WRITING_AUDIT_thesis_a.md.

Co-Authored-By: Claude Opus 5.5 <noreply@anthropic.com>
</commit_message>
<xml_diff>
--- a/#writing/summary/summary.docx
+++ b/#writing/summary/summary.docx
@@ -47,7 +47,7 @@
         <w:t xml:space="preserve"> </w:t>
       </w:r>
       <w:r>
-        <w:t xml:space="preserve">60,587 words, 33 figures and 18 tables, and</w:t>
+        <w:t xml:space="preserve">60,621 words, 33 figures and 18 tables, and</w:t>
       </w:r>
       <w:r>
         <w:t xml:space="preserve"> </w:t>
@@ -880,7 +880,7 @@
         <w:t xml:space="preserve"> </w:t>
       </w:r>
       <w:r>
-        <w:t xml:space="preserve">robust in timing, but their depth depends on the humidity correction of the sensor record: with</w:t>
+        <w:t xml:space="preserve">robust in timing. In the low-cost sensors’ record their depth depends on its humidity correction: with</w:t>
       </w:r>
       <w:r>
         <w:t xml:space="preserve"> </w:t>

</xml_diff>